<commit_message>
PR8: audit fixes (CheckIt is always strict: negative x^2 and strict outside-answer items; doc tool entity decoding; \lt; distractor origins), audit md, README row
Co-Authored-By: Claude Opus 5.5 <noreply@anthropic.com>
Claude-Session: https://claude.ai/code/session_013Y8PfETWcMLvmUEpCdE8Wq
</commit_message>
<xml_diff>
--- a/support-materials/PR8/PR8_worked_examples.docx
+++ b/support-materials/PR8/PR8_worked_examples.docx
@@ -133,7 +133,7 @@
           <w:sz w:val="40"/>
           <w:szCs w:val="40"/>
         </w:rPr>
-        <w:t xml:space="preserve">&amp;gt;3x</w:t>
+        <w:t xml:space="preserve">&gt;3x</w:t>
       </w:r>
     </w:p>
     <w:p>
@@ -356,7 +356,7 @@
           <w:sz w:val="40"/>
           <w:szCs w:val="40"/>
         </w:rPr>
-        <w:t xml:space="preserve">−4x−3&amp;gt;0</w:t>
+        <w:t xml:space="preserve">−4x−3&gt;0</w:t>
       </w:r>
     </w:p>
     <w:p>
@@ -535,7 +535,7 @@
           <w:sz w:val="40"/>
           <w:szCs w:val="40"/>
         </w:rPr>
-        <w:t xml:space="preserve">2−x≥ x</w:t>
+        <w:t xml:space="preserve">2−x</w:t>
       </w:r>
       <w:r>
         <w:rPr>
@@ -547,6 +547,15 @@
         </w:rPr>
         <w:t xml:space="preserve">2</w:t>
       </w:r>
+      <w:r>
+        <w:rPr>
+          <w:i/>
+          <w:iCs/>
+          <w:sz w:val="40"/>
+          <w:szCs w:val="40"/>
+        </w:rPr>
+        <w:t xml:space="preserve">&lt; x</w:t>
+      </w:r>
     </w:p>
     <w:p>
       <w:pPr>
@@ -562,7 +571,7 @@
         <w:spacing w:after="120" w:before="80" w:line="300"/>
       </w:pPr>
       <w:r>
-        <w:t xml:space="preserve">CheckIt mixes the terms up like this. Which inequality says the same thing, with 0 on one side?</w:t>
+        <w:t xml:space="preserve">CheckIt mixes the terms up like this. Which inequality says the same thing, with 0 on one side and a positive x² term?</w:t>
       </w:r>
     </w:p>
     <w:p>
@@ -597,7 +606,7 @@
           <w:i/>
           <w:iCs/>
         </w:rPr>
-        <w:t xml:space="preserve">+x−2≥ 0</w:t>
+        <w:t xml:space="preserve">+x−2&lt;0</w:t>
       </w:r>
     </w:p>
     <w:p>
@@ -632,7 +641,7 @@
           <w:i/>
           <w:iCs/>
         </w:rPr>
-        <w:t xml:space="preserve">−x+2≤ 0</w:t>
+        <w:t xml:space="preserve">+x+2&gt;0</w:t>
       </w:r>
     </w:p>
     <w:p>
@@ -667,7 +676,7 @@
           <w:i/>
           <w:iCs/>
         </w:rPr>
-        <w:t xml:space="preserve">+x−2≤ 0</w:t>
+        <w:t xml:space="preserve">+x−2&gt;0</w:t>
       </w:r>
     </w:p>
     <w:p>
@@ -702,7 +711,7 @@
           <w:i/>
           <w:iCs/>
         </w:rPr>
-        <w:t xml:space="preserve">−x+2≤ 0</w:t>
+        <w:t xml:space="preserve">−x+2&gt;0</w:t>
       </w:r>
     </w:p>
     <w:p>
@@ -719,24 +728,14 @@
         <w:spacing w:after="120" w:before="80" w:line="300"/>
       </w:pPr>
       <w:r>
-        <w:t xml:space="preserve">Move the </w:t>
-      </w:r>
-      <w:r>
-        <w:rPr>
-          <w:i/>
-          <w:iCs/>
-        </w:rPr>
-        <w:t xml:space="preserve">2−x</w:t>
-      </w:r>
-      <w:r>
-        <w:t xml:space="preserve"> to the right by subtracting it: </w:t>
-      </w:r>
-      <w:r>
-        <w:rPr>
-          <w:i/>
-          <w:iCs/>
-        </w:rPr>
-        <w:t xml:space="preserve">0≥ x</w:t>
+        <w:t xml:space="preserve">Move everything to the right by adding </w:t>
+      </w:r>
+      <w:r>
+        <w:rPr>
+          <w:i/>
+          <w:iCs/>
+        </w:rPr>
+        <w:t xml:space="preserve">x</w:t>
       </w:r>
       <w:r>
         <w:rPr>
@@ -747,6 +746,24 @@
         <w:t xml:space="preserve">2</w:t>
       </w:r>
       <w:r>
+        <w:t xml:space="preserve"> and subtracting 2: </w:t>
+      </w:r>
+      <w:r>
+        <w:rPr>
+          <w:i/>
+          <w:iCs/>
+        </w:rPr>
+        <w:t xml:space="preserve">0&lt; x</w:t>
+      </w:r>
+      <w:r>
+        <w:rPr>
+          <w:i/>
+          <w:iCs/>
+          <w:vertAlign w:val="superscript"/>
+        </w:rPr>
+        <w:t xml:space="preserve">2</w:t>
+      </w:r>
+      <w:r>
         <w:rPr>
           <w:i/>
           <w:iCs/>
@@ -776,30 +793,10 @@
           <w:i/>
           <w:iCs/>
         </w:rPr>
-        <w:t xml:space="preserve">+x−2≤ 0</w:t>
-      </w:r>
-      <w:r>
-        <w:t xml:space="preserve">. Moving terms never flips the inequality. The </w:t>
-      </w:r>
-      <w:r>
-        <w:rPr>
-          <w:i/>
-          <w:iCs/>
-        </w:rPr>
-        <w:t xml:space="preserve">≥ 0</w:t>
-      </w:r>
-      <w:r>
-        <w:t xml:space="preserve"> version reads it backwards; </w:t>
-      </w:r>
-      <w:r>
-        <w:rPr>
-          <w:i/>
-          <w:iCs/>
-        </w:rPr>
-        <w:t xml:space="preserve">−x+2</w:t>
-      </w:r>
-      <w:r>
-        <w:t xml:space="preserve"> keeps the old signs instead of changing them; and </w:t>
+        <w:t xml:space="preserve">+x−2&gt;0</w:t>
+      </w:r>
+      <w:r>
+        <w:t xml:space="preserve">. Moving terms never flips the inequality. Moving everything left instead gives </w:t>
       </w:r>
       <w:r>
         <w:rPr>
@@ -821,15 +818,13 @@
           <w:i/>
           <w:iCs/>
         </w:rPr>
-        <w:t xml:space="preserve">−x+2≤ 0</w:t>
-      </w:r>
-      <w:r>
-        <w:t xml:space="preserve"> multiplies by −1 without flipping. </w:t>
-      </w:r>
-      <w:r>
-        <w:rPr>
-          <w:b/>
-          <w:bCs/>
+        <w:t xml:space="preserve">−x+2&lt;0</w:t>
+      </w:r>
+      <w:r>
+        <w:t xml:space="preserve">, and multiplying by −1 flips it to the same thing. </w:t>
+      </w:r>
+      <w:r>
+        <w:rPr>
           <w:i/>
           <w:iCs/>
         </w:rPr>
@@ -837,8 +832,6 @@
       </w:r>
       <w:r>
         <w:rPr>
-          <w:b/>
-          <w:bCs/>
           <w:i/>
           <w:iCs/>
           <w:vertAlign w:val="superscript"/>
@@ -847,12 +840,91 @@
       </w:r>
       <w:r>
         <w:rPr>
-          <w:b/>
-          <w:bCs/>
-          <w:i/>
-          <w:iCs/>
-        </w:rPr>
-        <w:t xml:space="preserve">+x−2≤ 0</w:t>
+          <w:i/>
+          <w:iCs/>
+        </w:rPr>
+        <w:t xml:space="preserve">+x−2&lt;0</w:t>
+      </w:r>
+      <w:r>
+        <w:t xml:space="preserve"> multiplies by −1 without flipping; </w:t>
+      </w:r>
+      <w:r>
+        <w:rPr>
+          <w:i/>
+          <w:iCs/>
+        </w:rPr>
+        <w:t xml:space="preserve">x</w:t>
+      </w:r>
+      <w:r>
+        <w:rPr>
+          <w:i/>
+          <w:iCs/>
+          <w:vertAlign w:val="superscript"/>
+        </w:rPr>
+        <w:t xml:space="preserve">2</w:t>
+      </w:r>
+      <w:r>
+        <w:rPr>
+          <w:i/>
+          <w:iCs/>
+        </w:rPr>
+        <w:t xml:space="preserve">+x+2&gt;0</w:t>
+      </w:r>
+      <w:r>
+        <w:t xml:space="preserve"> keeps the 2's sign when it moves; and </w:t>
+      </w:r>
+      <w:r>
+        <w:rPr>
+          <w:i/>
+          <w:iCs/>
+        </w:rPr>
+        <w:t xml:space="preserve">−x</w:t>
+      </w:r>
+      <w:r>
+        <w:rPr>
+          <w:i/>
+          <w:iCs/>
+          <w:vertAlign w:val="superscript"/>
+        </w:rPr>
+        <w:t xml:space="preserve">2</w:t>
+      </w:r>
+      <w:r>
+        <w:rPr>
+          <w:i/>
+          <w:iCs/>
+        </w:rPr>
+        <w:t xml:space="preserve">−x+2&gt;0</w:t>
+      </w:r>
+      <w:r>
+        <w:t xml:space="preserve"> flips the symbol just for moving terms. </w:t>
+      </w:r>
+      <w:r>
+        <w:rPr>
+          <w:b/>
+          <w:bCs/>
+          <w:i/>
+          <w:iCs/>
+        </w:rPr>
+        <w:t xml:space="preserve">x</w:t>
+      </w:r>
+      <w:r>
+        <w:rPr>
+          <w:b/>
+          <w:bCs/>
+          <w:i/>
+          <w:iCs/>
+          <w:vertAlign w:val="superscript"/>
+        </w:rPr>
+        <w:t xml:space="preserve">2</w:t>
+      </w:r>
+      <w:r>
+        <w:rPr>
+          <w:b/>
+          <w:bCs/>
+          <w:i/>
+          <w:iCs/>
+        </w:rPr>
+        <w:t xml:space="preserve">+x−2&gt;0</w:t>
       </w:r>
       <w:r>
         <w:rPr>
@@ -935,55 +1007,55 @@
         <w:t xml:space="preserve">A.  </w:t>
       </w:r>
       <w:r>
+        <w:t xml:space="preserve">Yes, since ≥ allows the value 0, and they give 0.</w:t>
+      </w:r>
+    </w:p>
+    <w:p>
+      <w:pPr>
+        <w:spacing w:after="40" w:before="20"/>
+        <w:ind w:left="360"/>
+      </w:pPr>
+      <w:r>
+        <w:rPr>
+          <w:b/>
+          <w:bCs/>
+        </w:rPr>
+        <w:t xml:space="preserve">B.  </w:t>
+      </w:r>
+      <w:r>
+        <w:t xml:space="preserve">Only 3, since it is the positive one.</w:t>
+      </w:r>
+    </w:p>
+    <w:p>
+      <w:pPr>
+        <w:spacing w:after="40" w:before="20"/>
+        <w:ind w:left="360"/>
+      </w:pPr>
+      <w:r>
+        <w:rPr>
+          <w:b/>
+          <w:bCs/>
+        </w:rPr>
+        <w:t xml:space="preserve">C.  </w:t>
+      </w:r>
+      <w:r>
+        <w:t xml:space="preserve">Only if the parabola opens downward.</w:t>
+      </w:r>
+    </w:p>
+    <w:p>
+      <w:pPr>
+        <w:spacing w:after="40" w:before="20"/>
+        <w:ind w:left="360"/>
+      </w:pPr>
+      <w:r>
+        <w:rPr>
+          <w:b/>
+          <w:bCs/>
+        </w:rPr>
+        <w:t xml:space="preserve">D.  </w:t>
+      </w:r>
+      <w:r>
         <w:t xml:space="preserve">No, boundary points are never part of the answer.</w:t>
-      </w:r>
-    </w:p>
-    <w:p>
-      <w:pPr>
-        <w:spacing w:after="40" w:before="20"/>
-        <w:ind w:left="360"/>
-      </w:pPr>
-      <w:r>
-        <w:rPr>
-          <w:b/>
-          <w:bCs/>
-        </w:rPr>
-        <w:t xml:space="preserve">B.  </w:t>
-      </w:r>
-      <w:r>
-        <w:t xml:space="preserve">Only 3, since it is the positive one.</w:t>
-      </w:r>
-    </w:p>
-    <w:p>
-      <w:pPr>
-        <w:spacing w:after="40" w:before="20"/>
-        <w:ind w:left="360"/>
-      </w:pPr>
-      <w:r>
-        <w:rPr>
-          <w:b/>
-          <w:bCs/>
-        </w:rPr>
-        <w:t xml:space="preserve">C.  </w:t>
-      </w:r>
-      <w:r>
-        <w:t xml:space="preserve">Only if the parabola opens downward.</w:t>
-      </w:r>
-    </w:p>
-    <w:p>
-      <w:pPr>
-        <w:spacing w:after="40" w:before="20"/>
-        <w:ind w:left="360"/>
-      </w:pPr>
-      <w:r>
-        <w:rPr>
-          <w:b/>
-          <w:bCs/>
-        </w:rPr>
-        <w:t xml:space="preserve">D.  </w:t>
-      </w:r>
-      <w:r>
-        <w:t xml:space="preserve">Yes, since ≥ allows the value 0, and they give 0.</w:t>
       </w:r>
     </w:p>
     <w:p>
@@ -1349,7 +1421,17 @@
         <w:t xml:space="preserve">≥ 0</w:t>
       </w:r>
       <w:r>
-        <w:t xml:space="preserve">; and one test point decides its whole interval. </w:t>
+        <w:t xml:space="preserve">. "All three" would need every test to come out </w:t>
+      </w:r>
+      <w:r>
+        <w:rPr>
+          <w:i/>
+          <w:iCs/>
+        </w:rPr>
+        <w:t xml:space="preserve">≤ 0</w:t>
+      </w:r>
+      <w:r>
+        <w:t xml:space="preserve">, but −1 and 1 gave positive values. "Only right of 1/2" ignores the other tests, and the test at 1 actually failed there. </w:t>
       </w:r>
       <w:r>
         <w:rPr>
@@ -1446,7 +1528,7 @@
           <w:sz w:val="40"/>
           <w:szCs w:val="40"/>
         </w:rPr>
-        <w:t xml:space="preserve">(x−3)(x+5)&amp;gt;0</w:t>
+        <w:t xml:space="preserve">(x−3)(x+5)&gt;0</w:t>
       </w:r>
     </w:p>
     <w:p>
@@ -1618,7 +1700,7 @@
           <w:sz w:val="40"/>
           <w:szCs w:val="40"/>
         </w:rPr>
-        <w:t xml:space="preserve">8+2x≥ x</w:t>
+        <w:t xml:space="preserve">−2x</w:t>
       </w:r>
       <w:r>
         <w:rPr>
@@ -1630,6 +1712,15 @@
         </w:rPr>
         <w:t xml:space="preserve">2</w:t>
       </w:r>
+      <w:r>
+        <w:rPr>
+          <w:i/>
+          <w:iCs/>
+          <w:sz w:val="40"/>
+          <w:szCs w:val="40"/>
+        </w:rPr>
+        <w:t xml:space="preserve">&lt;9x+4</w:t>
+      </w:r>
     </w:p>
     <w:p>
       <w:pPr>
@@ -1645,7 +1736,7 @@
         <w:spacing w:after="120" w:before="80" w:line="300"/>
       </w:pPr>
       <w:r>
-        <w:t xml:space="preserve">Solve. Which is the answer?</w:t>
+        <w:t xml:space="preserve">This one is shuffled the way CheckIt does it. Solve. Which is the answer?</w:t>
       </w:r>
     </w:p>
     <w:p>
@@ -1665,7 +1756,7 @@
           <w:i/>
           <w:iCs/>
         </w:rPr>
-        <w:t xml:space="preserve">(−∞,−2]∪[4,∞)</w:t>
+        <w:t xml:space="preserve">(−4,−1/2)</w:t>
       </w:r>
     </w:p>
     <w:p>
@@ -1685,7 +1776,7 @@
           <w:i/>
           <w:iCs/>
         </w:rPr>
-        <w:t xml:space="preserve">[−2,4]</w:t>
+        <w:t xml:space="preserve">(−∞,−4)∪(−1/2,∞)</w:t>
       </w:r>
     </w:p>
     <w:p>
@@ -1705,7 +1796,7 @@
           <w:i/>
           <w:iCs/>
         </w:rPr>
-        <w:t xml:space="preserve">(−2,4)</w:t>
+        <w:t xml:space="preserve">(−∞,−4]∪[−1/2,∞)</w:t>
       </w:r>
     </w:p>
     <w:p>
@@ -1725,7 +1816,7 @@
           <w:i/>
           <w:iCs/>
         </w:rPr>
-        <w:t xml:space="preserve">[−4,2]</w:t>
+        <w:t xml:space="preserve">(−∞,1/2)∪(4,∞)</w:t>
       </w:r>
     </w:p>
     <w:p>
@@ -1742,14 +1833,14 @@
         <w:spacing w:after="120" w:before="80" w:line="300"/>
       </w:pPr>
       <w:r>
-        <w:t xml:space="preserve">Move everything to the right: </w:t>
-      </w:r>
-      <w:r>
-        <w:rPr>
-          <w:i/>
-          <w:iCs/>
-        </w:rPr>
-        <w:t xml:space="preserve">0≥ x</w:t>
+        <w:t xml:space="preserve">Add </w:t>
+      </w:r>
+      <w:r>
+        <w:rPr>
+          <w:i/>
+          <w:iCs/>
+        </w:rPr>
+        <w:t xml:space="preserve">2x</w:t>
       </w:r>
       <w:r>
         <w:rPr>
@@ -1760,11 +1851,47 @@
         <w:t xml:space="preserve">2</w:t>
       </w:r>
       <w:r>
-        <w:rPr>
-          <w:i/>
-          <w:iCs/>
-        </w:rPr>
-        <w:t xml:space="preserve">−2x−8</w:t>
+        <w:t xml:space="preserve"> to both sides so the </w:t>
+      </w:r>
+      <w:r>
+        <w:rPr>
+          <w:i/>
+          <w:iCs/>
+        </w:rPr>
+        <w:t xml:space="preserve">x</w:t>
+      </w:r>
+      <w:r>
+        <w:rPr>
+          <w:i/>
+          <w:iCs/>
+          <w:vertAlign w:val="superscript"/>
+        </w:rPr>
+        <w:t xml:space="preserve">2</w:t>
+      </w:r>
+      <w:r>
+        <w:t xml:space="preserve"> term is positive: </w:t>
+      </w:r>
+      <w:r>
+        <w:rPr>
+          <w:i/>
+          <w:iCs/>
+        </w:rPr>
+        <w:t xml:space="preserve">0&lt;2x</w:t>
+      </w:r>
+      <w:r>
+        <w:rPr>
+          <w:i/>
+          <w:iCs/>
+          <w:vertAlign w:val="superscript"/>
+        </w:rPr>
+        <w:t xml:space="preserve">2</w:t>
+      </w:r>
+      <w:r>
+        <w:rPr>
+          <w:i/>
+          <w:iCs/>
+        </w:rPr>
+        <w:t xml:space="preserve">+9x+4</w:t>
       </w:r>
       <w:r>
         <w:t xml:space="preserve">, so </w:t>
@@ -1774,74 +1901,89 @@
           <w:i/>
           <w:iCs/>
         </w:rPr>
-        <w:t xml:space="preserve">(x−4)(x+2)≤ 0</w:t>
-      </w:r>
-      <w:r>
-        <w:t xml:space="preserve">. Boundary points −2 and 4. Test 0: </w:t>
-      </w:r>
-      <w:r>
-        <w:rPr>
-          <w:i/>
-          <w:iCs/>
-        </w:rPr>
-        <w:t xml:space="preserve">−8≤ 0</w:t>
-      </w:r>
-      <w:r>
-        <w:t xml:space="preserve">, true, so the middle interval works, endpoints included because of the "or equal." The outside pieces are where </w:t>
-      </w:r>
-      <w:r>
-        <w:rPr>
-          <w:i/>
-          <w:iCs/>
-        </w:rPr>
-        <w:t xml:space="preserve">x</w:t>
-      </w:r>
-      <w:r>
-        <w:rPr>
-          <w:i/>
-          <w:iCs/>
-          <w:vertAlign w:val="superscript"/>
-        </w:rPr>
-        <w:t xml:space="preserve">2</w:t>
-      </w:r>
-      <w:r>
-        <w:rPr>
-          <w:i/>
-          <w:iCs/>
-        </w:rPr>
-        <w:t xml:space="preserve">−2x−8</w:t>
-      </w:r>
-      <w:r>
-        <w:t xml:space="preserve"> is positive; parentheses leave out the endpoints that </w:t>
-      </w:r>
-      <w:r>
-        <w:rPr>
-          <w:i/>
-          <w:iCs/>
-        </w:rPr>
-        <w:t xml:space="preserve">≥</w:t>
-      </w:r>
-      <w:r>
-        <w:t xml:space="preserve"> allows; and </w:t>
-      </w:r>
-      <w:r>
-        <w:rPr>
-          <w:i/>
-          <w:iCs/>
-        </w:rPr>
-        <w:t xml:space="preserve">[−4,2]</w:t>
-      </w:r>
-      <w:r>
-        <w:t xml:space="preserve"> flips the factors' signs. </w:t>
-      </w:r>
-      <w:r>
-        <w:rPr>
-          <w:b/>
-          <w:bCs/>
-          <w:i/>
-          <w:iCs/>
-        </w:rPr>
-        <w:t xml:space="preserve">[−2,4]</w:t>
+        <w:t xml:space="preserve">(2x+1)(x+4)&gt;0</w:t>
+      </w:r>
+      <w:r>
+        <w:t xml:space="preserve">. Boundary points −4 and </w:t>
+      </w:r>
+      <w:r>
+        <w:rPr>
+          <w:i/>
+          <w:iCs/>
+        </w:rPr>
+        <w:t xml:space="preserve">−1/2</w:t>
+      </w:r>
+      <w:r>
+        <w:t xml:space="preserve">. Test −1: </w:t>
+      </w:r>
+      <w:r>
+        <w:rPr>
+          <w:i/>
+          <w:iCs/>
+        </w:rPr>
+        <w:t xml:space="preserve">2−9+4=−3</w:t>
+      </w:r>
+      <w:r>
+        <w:t xml:space="preserve">, not </w:t>
+      </w:r>
+      <w:r>
+        <w:rPr>
+          <w:i/>
+          <w:iCs/>
+        </w:rPr>
+        <w:t xml:space="preserve">&gt;0</w:t>
+      </w:r>
+      <w:r>
+        <w:t xml:space="preserve">, so the middle fails and the outside pieces work, with open ends because </w:t>
+      </w:r>
+      <w:r>
+        <w:rPr>
+          <w:i/>
+          <w:iCs/>
+        </w:rPr>
+        <w:t xml:space="preserve">&gt;</w:t>
+      </w:r>
+      <w:r>
+        <w:t xml:space="preserve"> leaves out 0. </w:t>
+      </w:r>
+      <w:r>
+        <w:rPr>
+          <w:i/>
+          <w:iCs/>
+        </w:rPr>
+        <w:t xml:space="preserve">(−4,−1/2)</w:t>
+      </w:r>
+      <w:r>
+        <w:t xml:space="preserve"> is the middle, where the expression is negative; brackets include endpoints that </w:t>
+      </w:r>
+      <w:r>
+        <w:rPr>
+          <w:i/>
+          <w:iCs/>
+        </w:rPr>
+        <w:t xml:space="preserve">&gt;</w:t>
+      </w:r>
+      <w:r>
+        <w:t xml:space="preserve"> leaves out; and </w:t>
+      </w:r>
+      <w:r>
+        <w:rPr>
+          <w:i/>
+          <w:iCs/>
+        </w:rPr>
+        <w:t xml:space="preserve">(−∞,1/2)∪(4,∞)</w:t>
+      </w:r>
+      <w:r>
+        <w:t xml:space="preserve"> flips both boundary points' signs. </w:t>
+      </w:r>
+      <w:r>
+        <w:rPr>
+          <w:b/>
+          <w:bCs/>
+          <w:i/>
+          <w:iCs/>
+        </w:rPr>
+        <w:t xml:space="preserve">(−∞,−4)∪(−1/2,∞)</w:t>
       </w:r>
       <w:r>
         <w:rPr>
@@ -1908,7 +2050,7 @@
         <w:spacing w:after="120" w:before="80" w:line="300"/>
       </w:pPr>
       <w:r>
-        <w:t xml:space="preserve">The boundary points are −4 and 0. Testing x = −1 gives (−1)² + 4(−1) = −3. What does that tell you?</w:t>
+        <w:t xml:space="preserve">The boundary points are −4 and 0. Test x = −1. What does the result tell you?</w:t>
       </w:r>
     </w:p>
     <w:p>
@@ -1924,55 +2066,55 @@
         <w:t xml:space="preserve">A.  </w:t>
       </w:r>
       <w:r>
+        <w:t xml:space="preserve">The interval from −4 to 0 is left out of the answer.</w:t>
+      </w:r>
+    </w:p>
+    <w:p>
+      <w:pPr>
+        <w:spacing w:after="40" w:before="20"/>
+        <w:ind w:left="360"/>
+      </w:pPr>
+      <w:r>
+        <w:rPr>
+          <w:b/>
+          <w:bCs/>
+        </w:rPr>
+        <w:t xml:space="preserve">B.  </w:t>
+      </w:r>
+      <w:r>
+        <w:t xml:space="preserve">Only the single point x = −1 is left out of the answer.</w:t>
+      </w:r>
+    </w:p>
+    <w:p>
+      <w:pPr>
+        <w:spacing w:after="40" w:before="20"/>
+        <w:ind w:left="360"/>
+      </w:pPr>
+      <w:r>
+        <w:rPr>
+          <w:b/>
+          <w:bCs/>
+        </w:rPr>
+        <w:t xml:space="preserve">C.  </w:t>
+      </w:r>
+      <w:r>
+        <w:t xml:space="preserve">Nothing yet; test a few more points in there.</w:t>
+      </w:r>
+    </w:p>
+    <w:p>
+      <w:pPr>
+        <w:spacing w:after="40" w:before="20"/>
+        <w:ind w:left="360"/>
+      </w:pPr>
+      <w:r>
+        <w:rPr>
+          <w:b/>
+          <w:bCs/>
+        </w:rPr>
+        <w:t xml:space="preserve">D.  </w:t>
+      </w:r>
+      <w:r>
         <w:t xml:space="preserve">The interval from −4 to 0 is part of the answer, then.</w:t>
-      </w:r>
-    </w:p>
-    <w:p>
-      <w:pPr>
-        <w:spacing w:after="40" w:before="20"/>
-        <w:ind w:left="360"/>
-      </w:pPr>
-      <w:r>
-        <w:rPr>
-          <w:b/>
-          <w:bCs/>
-        </w:rPr>
-        <w:t xml:space="preserve">B.  </w:t>
-      </w:r>
-      <w:r>
-        <w:t xml:space="preserve">Only the single point x = −1 is left out of the answer.</w:t>
-      </w:r>
-    </w:p>
-    <w:p>
-      <w:pPr>
-        <w:spacing w:after="40" w:before="20"/>
-        <w:ind w:left="360"/>
-      </w:pPr>
-      <w:r>
-        <w:rPr>
-          <w:b/>
-          <w:bCs/>
-        </w:rPr>
-        <w:t xml:space="preserve">C.  </w:t>
-      </w:r>
-      <w:r>
-        <w:t xml:space="preserve">Nothing yet; test a few more points in there.</w:t>
-      </w:r>
-    </w:p>
-    <w:p>
-      <w:pPr>
-        <w:spacing w:after="40" w:before="20"/>
-        <w:ind w:left="360"/>
-      </w:pPr>
-      <w:r>
-        <w:rPr>
-          <w:b/>
-          <w:bCs/>
-        </w:rPr>
-        <w:t xml:space="preserve">D.  </w:t>
-      </w:r>
-      <w:r>
-        <w:t xml:space="preserve">The interval from −4 to 0 is left out of the answer.</w:t>
       </w:r>
     </w:p>
     <w:p>
@@ -1989,7 +2131,29 @@
         <w:spacing w:after="120" w:before="80" w:line="300"/>
       </w:pPr>
       <w:r>
-        <w:t xml:space="preserve">−3 is not </w:t>
+        <w:rPr>
+          <w:i/>
+          <w:iCs/>
+        </w:rPr>
+        <w:t xml:space="preserve">(−1)</w:t>
+      </w:r>
+      <w:r>
+        <w:rPr>
+          <w:i/>
+          <w:iCs/>
+          <w:vertAlign w:val="superscript"/>
+        </w:rPr>
+        <w:t xml:space="preserve">2</w:t>
+      </w:r>
+      <w:r>
+        <w:rPr>
+          <w:i/>
+          <w:iCs/>
+        </w:rPr>
+        <w:t xml:space="preserve">+4(−1)=−3</w:t>
+      </w:r>
+      <w:r>
+        <w:t xml:space="preserve">, which is not </w:t>
       </w:r>
       <w:r>
         <w:rPr>
@@ -2019,7 +2183,17 @@
         <w:t xml:space="preserve">(−∞,−4]∪[0,∞)</w:t>
       </w:r>
       <w:r>
-        <w:t xml:space="preserve">. A failing test does not make its interval part of the answer, and more tests in the same interval would only repeat what the first one said. </w:t>
+        <w:t xml:space="preserve">. A failing test does not make its interval part of the answer, and more tests in the same interval would only repeat what the first one said. And it is not just </w:t>
+      </w:r>
+      <w:r>
+        <w:rPr>
+          <w:i/>
+          <w:iCs/>
+        </w:rPr>
+        <w:t xml:space="preserve">x=−1</w:t>
+      </w:r>
+      <w:r>
+        <w:t xml:space="preserve">: every number between −4 and 0 gives the same sign. </w:t>
       </w:r>
       <w:r>
         <w:rPr>
@@ -2047,7 +2221,7 @@
           <wp:inline distT="0" distB="0" distL="0" distR="0">
             <wp:extent cx="4762500" cy="1343025"/>
             <wp:effectExtent t="0" r="0" b="0" l="0"/>
-            <wp:docPr id="1" name="wa1" descr="A number line with two shaded pieces. Plotted data: A number line from −5 to 5. There is an open dot at −3 with shading from it to the left, ending in an arrow, and an open dot at 5/2 with shading from it to the right, ending in an arrow. The part between −3 and 5/2 is not shaded." title="A number line with two shaded pieces"/>
+            <wp:docPr id="1" name="wa1" descr="A number line with two shaded pieces. Plotted data: A number line from −5 to 5. There is an open dot at −4 with shading from it to the left, ending in an arrow, and an open dot at 5/2 with shading from it to the right, ending in an arrow. The part between −4 and 5/2 is not shaded." title="A number line with two shaded pieces"/>
             <wp:cNvGraphicFramePr>
               <a:graphicFrameLocks xmlns:a="http://schemas.openxmlformats.org/drawingml/2006/main" noChangeAspect="1"/>
             </wp:cNvGraphicFramePr>
@@ -2101,7 +2275,7 @@
           <w:sz w:val="22"/>
           <w:szCs w:val="22"/>
         </w:rPr>
-        <w:t xml:space="preserve">A number line from −5 to 5. There is an open dot at −3 with shading from it to the left, ending in an arrow, and an open dot at 5/2 with shading from it to the right, ending in an arrow. The part between −3 and 5/2 is not shaded.</w:t>
+        <w:t xml:space="preserve">A number line from −5 to 5. There is an open dot at −4 with shading from it to the left, ending in an arrow, and an open dot at 5/2 with shading from it to the right, ending in an arrow. The part between −4 and 5/2 is not shaded.</w:t>
       </w:r>
     </w:p>
     <w:p>
@@ -2138,7 +2312,7 @@
           <w:i/>
           <w:iCs/>
         </w:rPr>
-        <w:t xml:space="preserve">(−3,5/2)</w:t>
+        <w:t xml:space="preserve">(−4,5/2)</w:t>
       </w:r>
     </w:p>
     <w:p>
@@ -2158,7 +2332,7 @@
           <w:i/>
           <w:iCs/>
         </w:rPr>
-        <w:t xml:space="preserve">(−∞,−3]∪[5/2,∞)</w:t>
+        <w:t xml:space="preserve">(−∞,−4]∪[5/2,∞)</w:t>
       </w:r>
     </w:p>
     <w:p>
@@ -2178,7 +2352,7 @@
           <w:i/>
           <w:iCs/>
         </w:rPr>
-        <w:t xml:space="preserve">(−∞,−3)∪(5/2,∞)</w:t>
+        <w:t xml:space="preserve">(−∞,−4)∪(5/2,∞)</w:t>
       </w:r>
     </w:p>
     <w:p>
@@ -2194,7 +2368,7 @@
         <w:t xml:space="preserve">D.  </w:t>
       </w:r>
       <w:r>
-        <w:t xml:space="preserve">[−∞, −3) ∪ (5/2, ∞]</w:t>
+        <w:t xml:space="preserve">[−∞, −4) ∪ (5/2, ∞]</w:t>
       </w:r>
     </w:p>
     <w:p>
@@ -2218,7 +2392,7 @@
           <w:i/>
           <w:iCs/>
         </w:rPr>
-        <w:t xml:space="preserve">(−∞,−3)</w:t>
+        <w:t xml:space="preserve">(−∞,−4)</w:t>
       </w:r>
       <w:r>
         <w:t xml:space="preserve"> and </w:t>
@@ -2248,7 +2422,7 @@
           <w:i/>
           <w:iCs/>
         </w:rPr>
-        <w:t xml:space="preserve">(−3,5/2)</w:t>
+        <w:t xml:space="preserve">(−4,5/2)</w:t>
       </w:r>
       <w:r>
         <w:t xml:space="preserve"> is the unshaded middle; brackets go with closed dots; and infinity never gets a bracket, since it is not a number you can include. </w:t>
@@ -2260,7 +2434,7 @@
           <w:i/>
           <w:iCs/>
         </w:rPr>
-        <w:t xml:space="preserve">(−∞,−3)∪(5/2,∞)</w:t>
+        <w:t xml:space="preserve">(−∞,−4)∪(5/2,∞)</w:t>
       </w:r>
       <w:r>
         <w:rPr>
@@ -2487,47 +2661,47 @@
           <w:i/>
           <w:iCs/>
         </w:rPr>
+        <w:t xml:space="preserve">(−∞,−1]∪[4,∞)</w:t>
+      </w:r>
+    </w:p>
+    <w:p>
+      <w:pPr>
+        <w:spacing w:after="40" w:before="20"/>
+        <w:ind w:left="360"/>
+      </w:pPr>
+      <w:r>
+        <w:rPr>
+          <w:b/>
+          <w:bCs/>
+        </w:rPr>
+        <w:t xml:space="preserve">C.  </w:t>
+      </w:r>
+      <w:r>
+        <w:rPr>
+          <w:i/>
+          <w:iCs/>
+        </w:rPr>
+        <w:t xml:space="preserve">[−1,4]</w:t>
+      </w:r>
+    </w:p>
+    <w:p>
+      <w:pPr>
+        <w:spacing w:after="40" w:before="20"/>
+        <w:ind w:left="360"/>
+      </w:pPr>
+      <w:r>
+        <w:rPr>
+          <w:b/>
+          <w:bCs/>
+        </w:rPr>
+        <w:t xml:space="preserve">D.  </w:t>
+      </w:r>
+      <w:r>
+        <w:rPr>
+          <w:i/>
+          <w:iCs/>
+        </w:rPr>
         <w:t xml:space="preserve">(−∞,−1)∪(4,∞)</w:t>
-      </w:r>
-    </w:p>
-    <w:p>
-      <w:pPr>
-        <w:spacing w:after="40" w:before="20"/>
-        <w:ind w:left="360"/>
-      </w:pPr>
-      <w:r>
-        <w:rPr>
-          <w:b/>
-          <w:bCs/>
-        </w:rPr>
-        <w:t xml:space="preserve">C.  </w:t>
-      </w:r>
-      <w:r>
-        <w:rPr>
-          <w:i/>
-          <w:iCs/>
-        </w:rPr>
-        <w:t xml:space="preserve">[−1,4]</w:t>
-      </w:r>
-    </w:p>
-    <w:p>
-      <w:pPr>
-        <w:spacing w:after="40" w:before="20"/>
-        <w:ind w:left="360"/>
-      </w:pPr>
-      <w:r>
-        <w:rPr>
-          <w:b/>
-          <w:bCs/>
-        </w:rPr>
-        <w:t xml:space="preserve">D.  </w:t>
-      </w:r>
-      <w:r>
-        <w:rPr>
-          <w:i/>
-          <w:iCs/>
-        </w:rPr>
-        <w:t xml:space="preserve">(−∞,−1]∪[4,∞)</w:t>
       </w:r>
     </w:p>
     <w:p>
@@ -2623,7 +2797,7 @@
           <w:sz w:val="40"/>
           <w:szCs w:val="40"/>
         </w:rPr>
-        <w:t xml:space="preserve">+5x≤ 2</w:t>
+        <w:t xml:space="preserve">+5x&gt;2</w:t>
       </w:r>
     </w:p>
     <w:p>
@@ -2680,7 +2854,7 @@
           <w:i/>
           <w:iCs/>
         </w:rPr>
-        <w:t xml:space="preserve">[−2,1/3]</w:t>
+        <w:t xml:space="preserve">(−∞,−2]∪[1/3,∞)</w:t>
       </w:r>
     </w:p>
     <w:p>
@@ -2700,7 +2874,7 @@
           <w:i/>
           <w:iCs/>
         </w:rPr>
-        <w:t xml:space="preserve">(−∞,−2]∪[1/3,∞)</w:t>
+        <w:t xml:space="preserve">(−∞,−2)∪(1/3,∞)</w:t>
       </w:r>
     </w:p>
     <w:p>
@@ -2720,7 +2894,7 @@
           <w:i/>
           <w:iCs/>
         </w:rPr>
-        <w:t xml:space="preserve">[−1/3,2]</w:t>
+        <w:t xml:space="preserve">(−∞,−1/3)∪(2,∞)</w:t>
       </w:r>
     </w:p>
     <w:p>
@@ -2759,7 +2933,7 @@
           <w:i/>
           <w:iCs/>
         </w:rPr>
-        <w:t xml:space="preserve">+5x−2≤ 0</w:t>
+        <w:t xml:space="preserve">+5x−2&gt;0</w:t>
       </w:r>
       <w:r>
         <w:t xml:space="preserve">, which factors as </w:t>
@@ -2769,7 +2943,7 @@
           <w:i/>
           <w:iCs/>
         </w:rPr>
-        <w:t xml:space="preserve">(3x−1)(x+2)≤ 0</w:t>
+        <w:t xml:space="preserve">(3x−1)(x+2)&gt;0</w:t>
       </w:r>
       <w:r>
         <w:t xml:space="preserve">. Boundary points </w:t>
@@ -2789,29 +2963,49 @@
           <w:i/>
           <w:iCs/>
         </w:rPr>
-        <w:t xml:space="preserve">−2≤ 0</w:t>
-      </w:r>
-      <w:r>
-        <w:t xml:space="preserve">, true, so the middle works, endpoints included. Parentheses drop the "or equal"; the outside pieces are where the expression is positive; and </w:t>
-      </w:r>
-      <w:r>
-        <w:rPr>
-          <w:i/>
-          <w:iCs/>
-        </w:rPr>
-        <w:t xml:space="preserve">[−1/3,2]</w:t>
-      </w:r>
-      <w:r>
-        <w:t xml:space="preserve"> flips both boundary points' signs. </w:t>
-      </w:r>
-      <w:r>
-        <w:rPr>
-          <w:b/>
-          <w:bCs/>
-          <w:i/>
-          <w:iCs/>
-        </w:rPr>
-        <w:t xml:space="preserve">[−2,1/3]</w:t>
+        <w:t xml:space="preserve">−2&gt;0</w:t>
+      </w:r>
+      <w:r>
+        <w:t xml:space="preserve"> is false, so the middle fails and the outside pieces work, with open ends. </w:t>
+      </w:r>
+      <w:r>
+        <w:rPr>
+          <w:i/>
+          <w:iCs/>
+        </w:rPr>
+        <w:t xml:space="preserve">(−2,1/3)</w:t>
+      </w:r>
+      <w:r>
+        <w:t xml:space="preserve"> is the middle, where the expression is negative; brackets include the endpoints that </w:t>
+      </w:r>
+      <w:r>
+        <w:rPr>
+          <w:i/>
+          <w:iCs/>
+        </w:rPr>
+        <w:t xml:space="preserve">&gt;</w:t>
+      </w:r>
+      <w:r>
+        <w:t xml:space="preserve"> leaves out; and </w:t>
+      </w:r>
+      <w:r>
+        <w:rPr>
+          <w:i/>
+          <w:iCs/>
+        </w:rPr>
+        <w:t xml:space="preserve">−1/3</w:t>
+      </w:r>
+      <w:r>
+        <w:t xml:space="preserve"> and 2 flip both boundary points' signs. </w:t>
+      </w:r>
+      <w:r>
+        <w:rPr>
+          <w:b/>
+          <w:bCs/>
+          <w:i/>
+          <w:iCs/>
+        </w:rPr>
+        <w:t xml:space="preserve">(−∞,−2)∪(1/3,∞)</w:t>
       </w:r>
       <w:r>
         <w:rPr>
@@ -3385,7 +3579,7 @@
           <w:sz w:val="40"/>
           <w:szCs w:val="40"/>
         </w:rPr>
-        <w:t xml:space="preserve">+x−3lt;0</w:t>
+        <w:t xml:space="preserve">+x−3&lt;0</w:t>
       </w:r>
     </w:p>
     <w:p>
@@ -3400,7 +3594,7 @@
           <w:sz w:val="40"/>
           <w:szCs w:val="40"/>
         </w:rPr>
-        <w:t xml:space="preserve">(2x+3)(x−1)lt;0</w:t>
+        <w:t xml:space="preserve">(2x+3)(x−1)&lt;0</w:t>
       </w:r>
     </w:p>
     <w:p>
@@ -3585,7 +3779,7 @@
           <w:sz w:val="40"/>
           <w:szCs w:val="40"/>
         </w:rPr>
-        <w:t xml:space="preserve">−5x+4&amp;gt;0</w:t>
+        <w:t xml:space="preserve">−5x+4&gt;0</w:t>
       </w:r>
     </w:p>
     <w:p>
@@ -3743,7 +3937,7 @@
           <w:sz w:val="40"/>
           <w:szCs w:val="40"/>
         </w:rPr>
-        <w:t xml:space="preserve">(x−3)(x+2)lt;0</w:t>
+        <w:t xml:space="preserve">(x−3)(x+2)&lt;0</w:t>
       </w:r>
     </w:p>
     <w:p>
@@ -3758,7 +3952,7 @@
           <w:sz w:val="40"/>
           <w:szCs w:val="40"/>
         </w:rPr>
-        <w:t xml:space="preserve">x−3lt;0  and  x+2lt;0</w:t>
+        <w:t xml:space="preserve">x−3&lt;0  and  x+2&lt;0</w:t>
       </w:r>
     </w:p>
     <w:p>
@@ -3773,7 +3967,7 @@
           <w:sz w:val="40"/>
           <w:szCs w:val="40"/>
         </w:rPr>
-        <w:t xml:space="preserve">xlt;3  and  xlt;−2</w:t>
+        <w:t xml:space="preserve">x&lt;3  and  x&lt;−2</w:t>
       </w:r>
     </w:p>
     <w:p>
@@ -3812,207 +4006,10 @@
           <w:i/>
           <w:iCs/>
         </w:rPr>
-        <w:t xml:space="preserve">−x−</w:t>
-      </w:r>
-      <w:r>
-        <w:t xml:space="preserve">olving </w:t>
-      </w:r>
-      <w:r>
-        <w:rPr>
-          <w:i/>
-          <w:iCs/>
-        </w:rPr>
-        <w:t xml:space="preserve">x</w:t>
-      </w:r>
-      <w:r>
-        <w:rPr>
-          <w:i/>
-          <w:iCs/>
-          <w:vertAlign w:val="superscript"/>
-        </w:rPr>
-        <w:t xml:space="preserve">2</w:t>
-      </w:r>
-      <w:r>
-        <w:rPr>
-          <w:i/>
-          <w:iCs/>
-        </w:rPr>
-        <w:t xml:space="preserve">−x−</w:t>
-      </w:r>
-      <w:r>
-        <w:t xml:space="preserve">lving </w:t>
-      </w:r>
-      <w:r>
-        <w:rPr>
-          <w:i/>
-          <w:iCs/>
-        </w:rPr>
-        <w:t xml:space="preserve">x</w:t>
-      </w:r>
-      <w:r>
-        <w:rPr>
-          <w:i/>
-          <w:iCs/>
-          <w:vertAlign w:val="superscript"/>
-        </w:rPr>
-        <w:t xml:space="preserve">2</w:t>
-      </w:r>
-      <w:r>
-        <w:rPr>
-          <w:i/>
-          <w:iCs/>
-        </w:rPr>
-        <w:t xml:space="preserve">−x−</w:t>
-      </w:r>
-      <w:r>
-        <w:t xml:space="preserve">ving </w:t>
-      </w:r>
-      <w:r>
-        <w:rPr>
-          <w:i/>
-          <w:iCs/>
-        </w:rPr>
-        <w:t xml:space="preserve">x</w:t>
-      </w:r>
-      <w:r>
-        <w:rPr>
-          <w:i/>
-          <w:iCs/>
-          <w:vertAlign w:val="superscript"/>
-        </w:rPr>
-        <w:t xml:space="preserve">2</w:t>
-      </w:r>
-      <w:r>
-        <w:rPr>
-          <w:i/>
-          <w:iCs/>
-        </w:rPr>
-        <w:t xml:space="preserve">−x−</w:t>
-      </w:r>
-      <w:r>
-        <w:t xml:space="preserve">ing </w:t>
-      </w:r>
-      <w:r>
-        <w:rPr>
-          <w:i/>
-          <w:iCs/>
-        </w:rPr>
-        <w:t xml:space="preserve">x</w:t>
-      </w:r>
-      <w:r>
-        <w:rPr>
-          <w:i/>
-          <w:iCs/>
-          <w:vertAlign w:val="superscript"/>
-        </w:rPr>
-        <w:t xml:space="preserve">2</w:t>
-      </w:r>
-      <w:r>
-        <w:rPr>
-          <w:i/>
-          <w:iCs/>
-        </w:rPr>
-        <w:t xml:space="preserve">−x−</w:t>
-      </w:r>
-      <w:r>
-        <w:t xml:space="preserve">ng </w:t>
-      </w:r>
-      <w:r>
-        <w:rPr>
-          <w:i/>
-          <w:iCs/>
-        </w:rPr>
-        <w:t xml:space="preserve">x</w:t>
-      </w:r>
-      <w:r>
-        <w:rPr>
-          <w:i/>
-          <w:iCs/>
-          <w:vertAlign w:val="superscript"/>
-        </w:rPr>
-        <w:t xml:space="preserve">2</w:t>
-      </w:r>
-      <w:r>
-        <w:rPr>
-          <w:i/>
-          <w:iCs/>
-        </w:rPr>
-        <w:t xml:space="preserve">−x−</w:t>
-      </w:r>
-      <w:r>
-        <w:t xml:space="preserve">g </w:t>
-      </w:r>
-      <w:r>
-        <w:rPr>
-          <w:i/>
-          <w:iCs/>
-        </w:rPr>
-        <w:t xml:space="preserve">x</w:t>
-      </w:r>
-      <w:r>
-        <w:rPr>
-          <w:i/>
-          <w:iCs/>
-          <w:vertAlign w:val="superscript"/>
-        </w:rPr>
-        <w:t xml:space="preserve">2</w:t>
-      </w:r>
-      <w:r>
-        <w:rPr>
-          <w:i/>
-          <w:iCs/>
-        </w:rPr>
-        <w:t xml:space="preserve">−x−</w:t>
-      </w:r>
-      <w:r>
-        <w:t xml:space="preserve"> </w:t>
-      </w:r>
-      <w:r>
-        <w:rPr>
-          <w:i/>
-          <w:iCs/>
-        </w:rPr>
-        <w:t xml:space="preserve">x</w:t>
-      </w:r>
-      <w:r>
-        <w:rPr>
-          <w:i/>
-          <w:iCs/>
-          <w:vertAlign w:val="superscript"/>
-        </w:rPr>
-        <w:t xml:space="preserve">2</w:t>
-      </w:r>
-      <w:r>
-        <w:rPr>
-          <w:i/>
-          <w:iCs/>
-        </w:rPr>
-        <w:t xml:space="preserve">−x−</w:t>
-      </w:r>
-      <w:r>
-        <w:rPr>
-          <w:i/>
-          <w:iCs/>
-        </w:rPr>
-        <w:t xml:space="preserve">x</w:t>
-      </w:r>
-      <w:r>
-        <w:rPr>
-          <w:i/>
-          <w:iCs/>
-          <w:vertAlign w:val="superscript"/>
-        </w:rPr>
-        <w:t xml:space="preserve">2</w:t>
-      </w:r>
-      <w:r>
-        <w:rPr>
-          <w:i/>
-          <w:iCs/>
-        </w:rPr>
-        <w:t xml:space="preserve">−x−</w:t>
-      </w:r>
-      <w:r>
-        <w:t xml:space="preserve">( x^{2}-x-6</w:t>
+        <w:t xml:space="preserve">−x−6&lt;0</w:t>
+      </w:r>
+      <w:r>
+        <w:t xml:space="preserve">, a student did this and answered (−∞, −2). What is the mistake, if any?</w:t>
       </w:r>
     </w:p>
     <w:p>

</xml_diff>